<commit_message>
feat: add testing framework and e2e tests with Playwright
- Updated package.json to include Jest and Playwright for testing.
- Added Playwright configuration file for e2e testing setup.
- Created a smoke test to verify Jest integration.
- Enhanced docker-compose.yml to support Redis and MinIO services with health checks.
- Updated backend service environment variables for better configuration management.
</commit_message>
<xml_diff>
--- a/Document.docx
+++ b/Document.docx
@@ -4010,7 +4010,7 @@
                 <w:sz w:val="19"/>
                 <w:szCs w:val="19"/>
               </w:rPr>
-              <w:t>AI Assessment</w:t>
+              <w:t>AI Speaking Feedback</w:t>
             </w:r>
           </w:p>
         </w:tc>
@@ -4040,7 +4040,7 @@
                 <w:sz w:val="19"/>
                 <w:szCs w:val="19"/>
               </w:rPr>
-              <w:t>AI job, queue, gọi model, validate output, retry, chống duplicate.</w:t>
+              <w:t>Transcript/STT, fluency, pronunciation-related signals, grammar/vocabulary feedback; chỉ dùng như hỗ trợ luyện tập.</w:t>
             </w:r>
           </w:p>
         </w:tc>
@@ -4105,7 +4105,7 @@
                 <w:sz w:val="19"/>
                 <w:szCs w:val="19"/>
               </w:rPr>
-              <w:t>AI Speaking Feedback</w:t>
+              <w:t>AI Writing Feedback</w:t>
             </w:r>
           </w:p>
         </w:tc>
@@ -4135,7 +4135,7 @@
                 <w:sz w:val="19"/>
                 <w:szCs w:val="19"/>
               </w:rPr>
-              <w:t>Transcript/STT, fluency, pronunciation-related signals, grammar/vocabulary feedback; chỉ dùng như hỗ trợ luyện tập.</w:t>
+              <w:t>Grammar, vocabulary, coherence, task response và gợi ý cải thiện.</w:t>
             </w:r>
           </w:p>
         </w:tc>
@@ -4200,7 +4200,7 @@
                 <w:sz w:val="19"/>
                 <w:szCs w:val="19"/>
               </w:rPr>
-              <w:t>AI Writing Feedback</w:t>
+              <w:t>Result &amp; CEFR Mapping</w:t>
             </w:r>
           </w:p>
         </w:tc>
@@ -4230,7 +4230,102 @@
                 <w:sz w:val="19"/>
                 <w:szCs w:val="19"/>
               </w:rPr>
-              <w:t>Grammar, vocabulary, coherence, task response và gợi ý cải thiện.</w:t>
+              <w:t>Hiển thị kết quả/feedback; mapping theo cấu hình rubric của hệ thống.</w:t>
+            </w:r>
+          </w:p>
+        </w:tc>
+      </w:tr>
+      <w:tr>
+        <w:trPr>
+          <w:trHeight w:val="345"/>
+        </w:trPr>
+        <w:tc>
+          <w:tcPr>
+            <w:tcW w:w="567" w:type="dxa"/>
+            <w:tcBorders>
+              <w:top w:val="single" w:sz="8"/>
+              <w:left w:val="single" w:sz="8"/>
+              <w:bottom w:val="single" w:sz="8"/>
+              <w:right w:val="single" w:sz="8"/>
+            </w:tcBorders>
+            <w:tcMar>
+              <w:left w:w="108" w:type="dxa"/>
+              <w:right w:w="108" w:type="dxa"/>
+            </w:tcMar>
+            <w:vAlign w:val="center"/>
+          </w:tcPr>
+          <w:p>
+            <w:pPr>
+              <w:bidi w:val="0"/>
+              <w:spacing w:before="0" w:beforeAutospacing="off" w:after="100" w:afterAutospacing="off"/>
+            </w:pPr>
+            <w:r>
+              <w:rPr>
+                <w:rFonts w:ascii="Aptos" w:hAnsi="Aptos" w:eastAsia="Aptos" w:cs="Aptos"/>
+                <w:sz w:val="19"/>
+                <w:szCs w:val="19"/>
+              </w:rPr>
+              <w:t>F08</w:t>
+            </w:r>
+          </w:p>
+        </w:tc>
+        <w:tc>
+          <w:tcPr>
+            <w:tcW w:w="2268" w:type="dxa"/>
+            <w:tcBorders>
+              <w:top w:val="single" w:sz="8"/>
+              <w:left w:val="single" w:sz="8"/>
+              <w:bottom w:val="single" w:sz="8"/>
+              <w:right w:val="single" w:sz="8"/>
+            </w:tcBorders>
+            <w:tcMar>
+              <w:left w:w="108" w:type="dxa"/>
+              <w:right w:w="108" w:type="dxa"/>
+            </w:tcMar>
+            <w:vAlign w:val="center"/>
+          </w:tcPr>
+          <w:p>
+            <w:pPr>
+              <w:bidi w:val="0"/>
+              <w:spacing w:before="0" w:beforeAutospacing="off" w:after="100" w:afterAutospacing="off"/>
+            </w:pPr>
+            <w:r>
+              <w:rPr>
+                <w:rFonts w:ascii="Aptos" w:hAnsi="Aptos" w:eastAsia="Aptos" w:cs="Aptos"/>
+                <w:sz w:val="19"/>
+                <w:szCs w:val="19"/>
+              </w:rPr>
+              <w:t>Progress Dashboard</w:t>
+            </w:r>
+          </w:p>
+        </w:tc>
+        <w:tc>
+          <w:tcPr>
+            <w:tcW w:w="6236" w:type="dxa"/>
+            <w:tcBorders>
+              <w:top w:val="single" w:sz="8"/>
+              <w:left w:val="single" w:sz="8"/>
+              <w:bottom w:val="single" w:sz="8"/>
+              <w:right w:val="single" w:sz="8"/>
+            </w:tcBorders>
+            <w:tcMar>
+              <w:left w:w="108" w:type="dxa"/>
+              <w:right w:w="108" w:type="dxa"/>
+            </w:tcMar>
+            <w:vAlign w:val="center"/>
+          </w:tcPr>
+          <w:p>
+            <w:pPr>
+              <w:bidi w:val="0"/>
+              <w:spacing w:before="0" w:beforeAutospacing="off" w:after="100" w:afterAutospacing="off"/>
+            </w:pPr>
+            <w:r>
+              <w:rPr>
+                <w:rFonts w:ascii="Aptos" w:hAnsi="Aptos" w:eastAsia="Aptos" w:cs="Aptos"/>
+                <w:sz w:val="19"/>
+                <w:szCs w:val="19"/>
+              </w:rPr>
+              <w:t>Lịch sử bài, xu hướng tiến bộ, kỹ năng yếu, đề xuất luyện lại.</w:t>
             </w:r>
           </w:p>
         </w:tc>
@@ -4265,7 +4360,7 @@
                 <w:sz w:val="19"/>
                 <w:szCs w:val="19"/>
               </w:rPr>
-              <w:t>F08</w:t>
+              <w:t>F9</w:t>
             </w:r>
           </w:p>
         </w:tc>
@@ -4295,7 +4390,7 @@
                 <w:sz w:val="19"/>
                 <w:szCs w:val="19"/>
               </w:rPr>
-              <w:t>Result &amp; CEFR Mapping</w:t>
+              <w:t>Teacher Review</w:t>
             </w:r>
           </w:p>
         </w:tc>
@@ -4325,102 +4420,7 @@
                 <w:sz w:val="19"/>
                 <w:szCs w:val="19"/>
               </w:rPr>
-              <w:t>Hiển thị kết quả/feedback; mapping theo cấu hình rubric của hệ thống.</w:t>
-            </w:r>
-          </w:p>
-        </w:tc>
-      </w:tr>
-      <w:tr>
-        <w:trPr>
-          <w:trHeight w:val="345"/>
-        </w:trPr>
-        <w:tc>
-          <w:tcPr>
-            <w:tcW w:w="567" w:type="dxa"/>
-            <w:tcBorders>
-              <w:top w:val="single" w:sz="8"/>
-              <w:left w:val="single" w:sz="8"/>
-              <w:bottom w:val="single" w:sz="8"/>
-              <w:right w:val="single" w:sz="8"/>
-            </w:tcBorders>
-            <w:tcMar>
-              <w:left w:w="108" w:type="dxa"/>
-              <w:right w:w="108" w:type="dxa"/>
-            </w:tcMar>
-            <w:vAlign w:val="center"/>
-          </w:tcPr>
-          <w:p>
-            <w:pPr>
-              <w:bidi w:val="0"/>
-              <w:spacing w:before="0" w:beforeAutospacing="off" w:after="100" w:afterAutospacing="off"/>
-            </w:pPr>
-            <w:r>
-              <w:rPr>
-                <w:rFonts w:ascii="Aptos" w:hAnsi="Aptos" w:eastAsia="Aptos" w:cs="Aptos"/>
-                <w:sz w:val="19"/>
-                <w:szCs w:val="19"/>
-              </w:rPr>
-              <w:t>F09</w:t>
-            </w:r>
-          </w:p>
-        </w:tc>
-        <w:tc>
-          <w:tcPr>
-            <w:tcW w:w="2268" w:type="dxa"/>
-            <w:tcBorders>
-              <w:top w:val="single" w:sz="8"/>
-              <w:left w:val="single" w:sz="8"/>
-              <w:bottom w:val="single" w:sz="8"/>
-              <w:right w:val="single" w:sz="8"/>
-            </w:tcBorders>
-            <w:tcMar>
-              <w:left w:w="108" w:type="dxa"/>
-              <w:right w:w="108" w:type="dxa"/>
-            </w:tcMar>
-            <w:vAlign w:val="center"/>
-          </w:tcPr>
-          <w:p>
-            <w:pPr>
-              <w:bidi w:val="0"/>
-              <w:spacing w:before="0" w:beforeAutospacing="off" w:after="100" w:afterAutospacing="off"/>
-            </w:pPr>
-            <w:r>
-              <w:rPr>
-                <w:rFonts w:ascii="Aptos" w:hAnsi="Aptos" w:eastAsia="Aptos" w:cs="Aptos"/>
-                <w:sz w:val="19"/>
-                <w:szCs w:val="19"/>
-              </w:rPr>
-              <w:t>Progress Dashboard</w:t>
-            </w:r>
-          </w:p>
-        </w:tc>
-        <w:tc>
-          <w:tcPr>
-            <w:tcW w:w="6236" w:type="dxa"/>
-            <w:tcBorders>
-              <w:top w:val="single" w:sz="8"/>
-              <w:left w:val="single" w:sz="8"/>
-              <w:bottom w:val="single" w:sz="8"/>
-              <w:right w:val="single" w:sz="8"/>
-            </w:tcBorders>
-            <w:tcMar>
-              <w:left w:w="108" w:type="dxa"/>
-              <w:right w:w="108" w:type="dxa"/>
-            </w:tcMar>
-            <w:vAlign w:val="center"/>
-          </w:tcPr>
-          <w:p>
-            <w:pPr>
-              <w:bidi w:val="0"/>
-              <w:spacing w:before="0" w:beforeAutospacing="off" w:after="100" w:afterAutospacing="off"/>
-            </w:pPr>
-            <w:r>
-              <w:rPr>
-                <w:rFonts w:ascii="Aptos" w:hAnsi="Aptos" w:eastAsia="Aptos" w:cs="Aptos"/>
-                <w:sz w:val="19"/>
-                <w:szCs w:val="19"/>
-              </w:rPr>
-              <w:t>Lịch sử bài, xu hướng tiến bộ, kỹ năng yếu, đề xuất luyện lại.</w:t>
+              <w:t>Queue review, xem bài, chỉnh/ghi feedback, xử lý yêu cầu review.</w:t>
             </w:r>
           </w:p>
         </w:tc>
@@ -4485,7 +4485,7 @@
                 <w:sz w:val="19"/>
                 <w:szCs w:val="19"/>
               </w:rPr>
-              <w:t>Teacher Review</w:t>
+              <w:t>AI Chatbot</w:t>
             </w:r>
           </w:p>
         </w:tc>
@@ -4515,7 +4515,7 @@
                 <w:sz w:val="19"/>
                 <w:szCs w:val="19"/>
               </w:rPr>
-              <w:t>Queue review, xem bài, chỉnh/ghi feedback, xử lý yêu cầu review.</w:t>
+              <w:t>Hỏi đáp, role-play, dùng context học tập có kiểm soát.</w:t>
             </w:r>
           </w:p>
         </w:tc>
@@ -4580,7 +4580,7 @@
                 <w:sz w:val="19"/>
                 <w:szCs w:val="19"/>
               </w:rPr>
-              <w:t>AI Chatbot</w:t>
+              <w:t>Administration</w:t>
             </w:r>
           </w:p>
         </w:tc>
@@ -4610,7 +4610,7 @@
                 <w:sz w:val="19"/>
                 <w:szCs w:val="19"/>
               </w:rPr>
-              <w:t>Hỏi đáp, role-play, dùng context học tập có kiểm soát.</w:t>
+              <w:t xml:space="preserve">User, role, rubric, AI profile, job monitoring, </w:t>
             </w:r>
           </w:p>
         </w:tc>
@@ -4675,7 +4675,7 @@
                 <w:sz w:val="19"/>
                 <w:szCs w:val="19"/>
               </w:rPr>
-              <w:t>Administration</w:t>
+              <w:t>Notification</w:t>
             </w:r>
           </w:p>
         </w:tc>
@@ -4705,7 +4705,7 @@
                 <w:sz w:val="19"/>
                 <w:szCs w:val="19"/>
               </w:rPr>
-              <w:t xml:space="preserve">User, role, rubric, AI profile, job monitoring, </w:t>
+              <w:t>Email/in-app thông báo kết quả, review và trạng thái job.</w:t>
             </w:r>
           </w:p>
         </w:tc>
@@ -4770,7 +4770,7 @@
                 <w:sz w:val="19"/>
                 <w:szCs w:val="19"/>
               </w:rPr>
-              <w:t>Notification</w:t>
+              <w:t>Analytics</w:t>
             </w:r>
           </w:p>
         </w:tc>
@@ -4800,7 +4800,7 @@
                 <w:sz w:val="19"/>
                 <w:szCs w:val="19"/>
               </w:rPr>
-              <w:t>Email/in-app thông báo kết quả, review và trạng thái job.</w:t>
+              <w:t>Tỷ lệ hoàn thành, điểm trung bình, skill weakness, usage.</w:t>
             </w:r>
           </w:p>
         </w:tc>
@@ -4836,101 +4836,6 @@
                 <w:szCs w:val="19"/>
               </w:rPr>
               <w:t>F14</w:t>
-            </w:r>
-          </w:p>
-        </w:tc>
-        <w:tc>
-          <w:tcPr>
-            <w:tcW w:w="2268" w:type="dxa"/>
-            <w:tcBorders>
-              <w:top w:val="single" w:sz="8"/>
-              <w:left w:val="single" w:sz="8"/>
-              <w:bottom w:val="single" w:sz="8"/>
-              <w:right w:val="single" w:sz="8"/>
-            </w:tcBorders>
-            <w:tcMar>
-              <w:left w:w="108" w:type="dxa"/>
-              <w:right w:w="108" w:type="dxa"/>
-            </w:tcMar>
-            <w:vAlign w:val="center"/>
-          </w:tcPr>
-          <w:p>
-            <w:pPr>
-              <w:bidi w:val="0"/>
-              <w:spacing w:before="0" w:beforeAutospacing="off" w:after="100" w:afterAutospacing="off"/>
-            </w:pPr>
-            <w:r>
-              <w:rPr>
-                <w:rFonts w:ascii="Aptos" w:hAnsi="Aptos" w:eastAsia="Aptos" w:cs="Aptos"/>
-                <w:sz w:val="19"/>
-                <w:szCs w:val="19"/>
-              </w:rPr>
-              <w:t>Analytics</w:t>
-            </w:r>
-          </w:p>
-        </w:tc>
-        <w:tc>
-          <w:tcPr>
-            <w:tcW w:w="6236" w:type="dxa"/>
-            <w:tcBorders>
-              <w:top w:val="single" w:sz="8"/>
-              <w:left w:val="single" w:sz="8"/>
-              <w:bottom w:val="single" w:sz="8"/>
-              <w:right w:val="single" w:sz="8"/>
-            </w:tcBorders>
-            <w:tcMar>
-              <w:left w:w="108" w:type="dxa"/>
-              <w:right w:w="108" w:type="dxa"/>
-            </w:tcMar>
-            <w:vAlign w:val="center"/>
-          </w:tcPr>
-          <w:p>
-            <w:pPr>
-              <w:bidi w:val="0"/>
-              <w:spacing w:before="0" w:beforeAutospacing="off" w:after="100" w:afterAutospacing="off"/>
-            </w:pPr>
-            <w:r>
-              <w:rPr>
-                <w:rFonts w:ascii="Aptos" w:hAnsi="Aptos" w:eastAsia="Aptos" w:cs="Aptos"/>
-                <w:sz w:val="19"/>
-                <w:szCs w:val="19"/>
-              </w:rPr>
-              <w:t>Tỷ lệ hoàn thành, điểm trung bình, skill weakness, usage.</w:t>
-            </w:r>
-          </w:p>
-        </w:tc>
-      </w:tr>
-      <w:tr>
-        <w:trPr>
-          <w:trHeight w:val="300"/>
-        </w:trPr>
-        <w:tc>
-          <w:tcPr>
-            <w:tcW w:w="567" w:type="dxa"/>
-            <w:tcBorders>
-              <w:top w:val="single" w:sz="8"/>
-              <w:left w:val="single" w:sz="8"/>
-              <w:bottom w:val="single" w:sz="8"/>
-              <w:right w:val="single" w:sz="8"/>
-            </w:tcBorders>
-            <w:tcMar>
-              <w:left w:w="108" w:type="dxa"/>
-              <w:right w:w="108" w:type="dxa"/>
-            </w:tcMar>
-            <w:vAlign w:val="center"/>
-          </w:tcPr>
-          <w:p>
-            <w:pPr>
-              <w:bidi w:val="0"/>
-              <w:spacing w:before="0" w:beforeAutospacing="off" w:after="100" w:afterAutospacing="off"/>
-            </w:pPr>
-            <w:r>
-              <w:rPr>
-                <w:rFonts w:ascii="Aptos" w:hAnsi="Aptos" w:eastAsia="Aptos" w:cs="Aptos"/>
-                <w:sz w:val="19"/>
-                <w:szCs w:val="19"/>
-              </w:rPr>
-              <w:t>F15</w:t>
             </w:r>
           </w:p>
         </w:tc>
@@ -5547,7 +5452,7 @@
         <w:t>AI Pipeline: STT → preprocessing → assessment → structured output validation → result.</w:t>
       </w:r>
     </w:p>
-    <w:p xmlns:wp14="http://schemas.microsoft.com/office/word/2010/wordml" wp14:paraId="1D108B9B" wp14:textId="5635D35A">
+    <w:p xmlns:wp14="http://schemas.microsoft.com/office/word/2010/wordml" wp14:paraId="1D108B9B" wp14:textId="4BB68F6D">
       <w:pPr>
         <w:pStyle w:val="ListParagraph"/>
         <w:numPr>
@@ -5575,7 +5480,117 @@
           <w:highlight w:val="yellow"/>
           <w:lang w:val="en-US"/>
         </w:rPr>
-        <w:t>Queue/Worker: xử lý AI job bất đồng bộ, retry và chống duplicate.</w:t>
+        <w:t xml:space="preserve">Queue/Worker: </w:t>
+      </w:r>
+      <w:r>
+        <w:rPr>
+          <w:rFonts w:ascii="Aptos" w:hAnsi="Aptos" w:eastAsia="Aptos" w:cs="Aptos"/>
+          <w:noProof w:val="0"/>
+          <w:sz w:val="21"/>
+          <w:szCs w:val="21"/>
+          <w:highlight w:val="yellow"/>
+          <w:lang w:val="en-US"/>
+        </w:rPr>
+        <w:t>xử</w:t>
+      </w:r>
+      <w:r>
+        <w:rPr>
+          <w:rFonts w:ascii="Aptos" w:hAnsi="Aptos" w:eastAsia="Aptos" w:cs="Aptos"/>
+          <w:noProof w:val="0"/>
+          <w:sz w:val="21"/>
+          <w:szCs w:val="21"/>
+          <w:highlight w:val="yellow"/>
+          <w:lang w:val="en-US"/>
+        </w:rPr>
+        <w:t xml:space="preserve"> </w:t>
+      </w:r>
+      <w:r>
+        <w:rPr>
+          <w:rFonts w:ascii="Aptos" w:hAnsi="Aptos" w:eastAsia="Aptos" w:cs="Aptos"/>
+          <w:noProof w:val="0"/>
+          <w:sz w:val="21"/>
+          <w:szCs w:val="21"/>
+          <w:highlight w:val="yellow"/>
+          <w:lang w:val="en-US"/>
+        </w:rPr>
+        <w:t>lý</w:t>
+      </w:r>
+      <w:r>
+        <w:rPr>
+          <w:rFonts w:ascii="Aptos" w:hAnsi="Aptos" w:eastAsia="Aptos" w:cs="Aptos"/>
+          <w:noProof w:val="0"/>
+          <w:sz w:val="21"/>
+          <w:szCs w:val="21"/>
+          <w:highlight w:val="yellow"/>
+          <w:lang w:val="en-US"/>
+        </w:rPr>
+        <w:t xml:space="preserve"> thread </w:t>
+      </w:r>
+      <w:r>
+        <w:rPr>
+          <w:rFonts w:ascii="Aptos" w:hAnsi="Aptos" w:eastAsia="Aptos" w:cs="Aptos"/>
+          <w:noProof w:val="0"/>
+          <w:sz w:val="21"/>
+          <w:szCs w:val="21"/>
+          <w:highlight w:val="yellow"/>
+          <w:lang w:val="en-US"/>
+        </w:rPr>
+        <w:t>bất</w:t>
+      </w:r>
+      <w:r>
+        <w:rPr>
+          <w:rFonts w:ascii="Aptos" w:hAnsi="Aptos" w:eastAsia="Aptos" w:cs="Aptos"/>
+          <w:noProof w:val="0"/>
+          <w:sz w:val="21"/>
+          <w:szCs w:val="21"/>
+          <w:highlight w:val="yellow"/>
+          <w:lang w:val="en-US"/>
+        </w:rPr>
+        <w:t xml:space="preserve"> </w:t>
+      </w:r>
+      <w:r>
+        <w:rPr>
+          <w:rFonts w:ascii="Aptos" w:hAnsi="Aptos" w:eastAsia="Aptos" w:cs="Aptos"/>
+          <w:noProof w:val="0"/>
+          <w:sz w:val="21"/>
+          <w:szCs w:val="21"/>
+          <w:highlight w:val="yellow"/>
+          <w:lang w:val="en-US"/>
+        </w:rPr>
+        <w:t>đồng</w:t>
+      </w:r>
+      <w:r>
+        <w:rPr>
+          <w:rFonts w:ascii="Aptos" w:hAnsi="Aptos" w:eastAsia="Aptos" w:cs="Aptos"/>
+          <w:noProof w:val="0"/>
+          <w:sz w:val="21"/>
+          <w:szCs w:val="21"/>
+          <w:highlight w:val="yellow"/>
+          <w:lang w:val="en-US"/>
+        </w:rPr>
+        <w:t xml:space="preserve"> </w:t>
+      </w:r>
+      <w:r>
+        <w:rPr>
+          <w:rFonts w:ascii="Aptos" w:hAnsi="Aptos" w:eastAsia="Aptos" w:cs="Aptos"/>
+          <w:noProof w:val="0"/>
+          <w:sz w:val="21"/>
+          <w:szCs w:val="21"/>
+          <w:highlight w:val="yellow"/>
+          <w:lang w:val="en-US"/>
+        </w:rPr>
+        <w:t>bộ</w:t>
+      </w:r>
+      <w:r>
+        <w:rPr>
+          <w:rFonts w:ascii="Aptos" w:hAnsi="Aptos" w:eastAsia="Aptos" w:cs="Aptos"/>
+          <w:noProof w:val="0"/>
+          <w:sz w:val="21"/>
+          <w:szCs w:val="21"/>
+          <w:highlight w:val="yellow"/>
+          <w:lang w:val="en-US"/>
+        </w:rPr>
+        <w:t>, rate limit.</w:t>
       </w:r>
     </w:p>
     <w:p xmlns:wp14="http://schemas.microsoft.com/office/word/2010/wordml" wp14:paraId="26EE3D8F" wp14:textId="38C241CD">
@@ -14853,7 +14868,42 @@
         </w:r>
       </w:hyperlink>
     </w:p>
-    <w:p xmlns:wp14="http://schemas.microsoft.com/office/word/2010/wordml" wp14:paraId="0A56620C" wp14:textId="19B7E3FA">
+    <w:p>
+      <w:pPr>
+        <w:pStyle w:val="ListParagraph"/>
+        <w:numPr>
+          <w:ilvl w:val="0"/>
+          <w:numId w:val="1"/>
+        </w:numPr>
+        <w:spacing w:before="0" w:beforeAutospacing="off" w:after="0" w:afterAutospacing="off" w:line="276" w:lineRule="auto"/>
+        <w:ind w:left="360" w:right="0" w:hanging="360"/>
+        <w:rPr>
+          <w:noProof w:val="0"/>
+          <w:lang w:val="en-US"/>
+        </w:rPr>
+      </w:pPr>
+      <w:r>
+        <w:rPr>
+          <w:rFonts w:ascii="Aptos" w:hAnsi="Aptos" w:eastAsia="Aptos" w:cs="Aptos"/>
+          <w:noProof w:val="0"/>
+          <w:sz w:val="21"/>
+          <w:szCs w:val="21"/>
+          <w:lang w:val="en-US"/>
+        </w:rPr>
+        <w:t xml:space="preserve">EF EPI 2025 – Vietnam fact sheet: </w:t>
+      </w:r>
+      <w:hyperlink r:id="Rb40a1f7b3def475e">
+        <w:r>
+          <w:rPr>
+            <w:rStyle w:val="Hyperlink"/>
+            <w:noProof w:val="0"/>
+            <w:lang w:val="en-US"/>
+          </w:rPr>
+          <w:t>https://www.ef.com/assetscdn/WIBIwq6RdJvcD9bc8RMd/cefcom-epi-site/fact-sheets/2025/ef-epi-fact-sheet-vietnam-english.pdf</w:t>
+        </w:r>
+      </w:hyperlink>
+    </w:p>
+    <w:p>
       <w:pPr>
         <w:pStyle w:val="ListParagraph"/>
         <w:numPr>
@@ -14864,31 +14914,72 @@
         <w:spacing w:before="0" w:beforeAutospacing="off" w:after="0" w:afterAutospacing="off" w:line="276" w:lineRule="auto"/>
         <w:ind w:left="360" w:right="0" w:hanging="360"/>
         <w:rPr>
-          <w:rFonts w:ascii="Aptos" w:hAnsi="Aptos" w:eastAsia="Aptos" w:cs="Aptos"/>
-          <w:noProof w:val="0"/>
-          <w:sz w:val="21"/>
-          <w:szCs w:val="21"/>
+          <w:noProof w:val="0"/>
           <w:lang w:val="en-US"/>
         </w:rPr>
       </w:pPr>
-      <w:r>
-        <w:rPr>
-          <w:rFonts w:ascii="Aptos" w:hAnsi="Aptos" w:eastAsia="Aptos" w:cs="Aptos"/>
-          <w:noProof w:val="0"/>
-          <w:sz w:val="21"/>
-          <w:szCs w:val="21"/>
-          <w:lang w:val="en-US"/>
-        </w:rPr>
-        <w:t xml:space="preserve">EF EPI 2025 – Vietnam fact sheet: </w:t>
-      </w:r>
-      <w:hyperlink r:id="Re9ba4fe6d84c473f">
+      <w:hyperlink r:id="Re110672dbe5a4dc5">
+        <w:r>
+          <w:rPr>
+            <w:rFonts w:ascii="Aptos" w:hAnsi="Aptos" w:eastAsia="Aptos" w:cs="Aptos"/>
+            <w:noProof w:val="0"/>
+            <w:sz w:val="21"/>
+            <w:szCs w:val="21"/>
+            <w:lang w:val="en-US"/>
+          </w:rPr>
+          <w:t>https://aptiskytich.vn/</w:t>
+        </w:r>
+      </w:hyperlink>
+    </w:p>
+    <w:p>
+      <w:pPr>
+        <w:pStyle w:val="ListParagraph"/>
+        <w:numPr>
+          <w:ilvl w:val="0"/>
+          <w:numId w:val="1"/>
+        </w:numPr>
+        <w:bidi w:val="0"/>
+        <w:spacing w:before="0" w:beforeAutospacing="off" w:after="0" w:afterAutospacing="off" w:line="276" w:lineRule="auto"/>
+        <w:ind w:left="360" w:right="0" w:hanging="360"/>
+        <w:rPr>
+          <w:noProof w:val="0"/>
+          <w:lang w:val="en-US"/>
+        </w:rPr>
+      </w:pPr>
+      <w:hyperlink r:id="Rb6d021267ad84372">
         <w:r>
           <w:rPr>
             <w:rStyle w:val="Hyperlink"/>
             <w:noProof w:val="0"/>
             <w:lang w:val="en-US"/>
           </w:rPr>
-          <w:t>https://www.ef.com/assetscdn/WIBIwq6RdJvcD9bc8RMd/cefcom-epi-site/fact-sheets/2025/ef-epi-fact-sheet-vietnam-english.pdf</w:t>
+          <w:t>https://aptis4success.com/</w:t>
+        </w:r>
+      </w:hyperlink>
+    </w:p>
+    <w:p>
+      <w:pPr>
+        <w:pStyle w:val="ListParagraph"/>
+        <w:numPr>
+          <w:ilvl w:val="0"/>
+          <w:numId w:val="1"/>
+        </w:numPr>
+        <w:bidi w:val="0"/>
+        <w:spacing w:before="0" w:beforeAutospacing="off" w:after="0" w:afterAutospacing="off" w:line="276" w:lineRule="auto"/>
+        <w:ind w:left="360" w:right="0" w:hanging="360"/>
+        <w:rPr>
+          <w:noProof w:val="0"/>
+          <w:lang w:val="en-US"/>
+        </w:rPr>
+      </w:pPr>
+      <w:hyperlink r:id="R768aaab2f57543b4">
+        <w:r>
+          <w:rPr>
+            <w:rStyle w:val="Hyperlink"/>
+            <w:noProof w:val="0"/>
+            <w:lang w:val="en-US"/>
+          </w:rPr>
+          <w:t>https://thiieltstrenmay.com/reading_list</w:t>
         </w:r>
       </w:hyperlink>
     </w:p>

</xml_diff>